<commit_message>
fixed the sprocket counting, switched it to the memoized version and made it write output.txt
</commit_message>
<xml_diff>
--- a/Project Report.docx
+++ b/Project Report.docx
@@ -298,16 +298,14 @@
         </w:rPr>
         <w:t xml:space="preserve"> is already a key in the dictionary. If it is, we return the stored value; </w:t>
       </w:r>
-      <w:proofErr w:type="gramStart"/>
-      <w:r>
-        <w:rPr>
-          <w:rFonts w:ascii="Times New Roman" w:eastAsia="Times New Roman" w:hAnsi="Times New Roman" w:cs="Times New Roman"/>
-          <w:kern w:val="0"/>
-          <w14:ligatures w14:val="none"/>
-        </w:rPr>
-        <w:t>otherwise</w:t>
-      </w:r>
-      <w:proofErr w:type="gramEnd"/>
+      <w:r>
+        <w:rPr>
+          <w:rFonts w:ascii="Times New Roman" w:eastAsia="Times New Roman" w:hAnsi="Times New Roman" w:cs="Times New Roman"/>
+          <w:kern w:val="0"/>
+          <w14:ligatures w14:val="none"/>
+        </w:rPr>
+        <w:t>otherwise,</w:t>
+      </w:r>
       <w:r>
         <w:rPr>
           <w:rFonts w:ascii="Times New Roman" w:eastAsia="Times New Roman" w:hAnsi="Times New Roman" w:cs="Times New Roman"/>

</xml_diff>